<commit_message>
Implement unified Word template generator script, templates directory fetch, and flush top accent bar with lime-teal bottom rule
</commit_message>
<xml_diff>
--- a/Trescon_Global_Letterhead_Template.docx
+++ b/Trescon_Global_Letterhead_Template.docx
@@ -2,16 +2,11 @@
 <file path=word/document.xml><?xml version="1.0" encoding="utf-8"?>
 <w:document xmlns:wpc="http://schemas.microsoft.com/office/word/2010/wordprocessingCanvas" xmlns:mo="http://schemas.microsoft.com/office/mac/office/2008/main" xmlns:mc="http://schemas.openxmlformats.org/markup-compatibility/2006" xmlns:mv="urn:schemas-microsoft-com:mac:vml" xmlns:o="urn:schemas-microsoft-com:office:office" xmlns:r="http://schemas.openxmlformats.org/officeDocument/2006/relationships" xmlns:m="http://schemas.openxmlformats.org/officeDocument/2006/math" xmlns:v="urn:schemas-microsoft-com:vml" xmlns:wp14="http://schemas.microsoft.com/office/word/2010/wordprocessingDrawing" xmlns:wp="http://schemas.openxmlformats.org/drawingml/2006/wordprocessingDrawing" xmlns:w10="urn:schemas-microsoft-com:office:word" xmlns:w="http://schemas.openxmlformats.org/wordprocessingml/2006/main" xmlns:w14="http://schemas.microsoft.com/office/word/2010/wordml" xmlns:wpg="http://schemas.microsoft.com/office/word/2010/wordprocessingGroup" xmlns:wpi="http://schemas.microsoft.com/office/word/2010/wordprocessingInk" xmlns:wne="http://schemas.microsoft.com/office/word/2006/wordml" xmlns:wps="http://schemas.microsoft.com/office/word/2010/wordprocessingShape" mc:Ignorable="w14 wp14">
   <w:body>
-    <w:p>
-      <w:pPr>
-        <w:spacing w:before="240" w:after="0"/>
-      </w:pPr>
-    </w:p>
     <w:sectPr>
       <w:headerReference w:type="default" r:id="rId9"/>
       <w:footerReference w:type="default" r:id="rId10"/>
       <w:pgSz w:w="11906" w:h="16838"/>
-      <w:pgMar w:top="1928" w:right="567" w:bottom="1134" w:left="567" w:header="227" w:footer="397" w:gutter="0"/>
+      <w:pgMar w:top="1587" w:right="567" w:bottom="1417" w:left="567" w:header="0" w:footer="720" w:gutter="0"/>
       <w:cols w:space="720"/>
       <w:docGrid w:linePitch="360"/>
     </w:sectPr>
@@ -26,100 +21,47 @@
       <w:pStyle w:val="Footer"/>
     </w:pPr>
   </w:p>
-  <w:tbl>
-    <w:tblPr>
-      <w:tblW w:type="auto" w:w="0"/>
-      <w:jc w:val="center"/>
-      <w:tblLook w:firstColumn="1" w:firstRow="1" w:lastColumn="0" w:lastRow="0" w:noHBand="0" w:noVBand="1" w:val="04A0"/>
-      <w:tblBorders>
-        <w:top w:val="single" w:sz="8" w:space="0" w:color="00A5A3"/>
-        <w:left w:val="none"/>
-        <w:bottom w:val="none"/>
-        <w:right w:val="none"/>
-        <w:insideH w:val="none"/>
-        <w:insideV w:val="none"/>
-      </w:tblBorders>
-    </w:tblPr>
-    <w:tblGrid>
-      <w:gridCol w:w="10772"/>
-    </w:tblGrid>
-    <w:tr>
-      <w:tc>
-        <w:tcPr>
-          <w:tcW w:type="dxa" w:w="10772"/>
-          <w:tcBorders>
-            <w:top w:val="none"/>
-            <w:left w:val="none"/>
-            <w:bottom w:val="none"/>
-            <w:right w:val="none"/>
-          </w:tcBorders>
-        </w:tcPr>
-        <w:p>
-          <w:pPr>
-            <w:spacing w:before="80" w:after="40"/>
-          </w:pPr>
-          <w:r>
-            <w:rPr>
-              <w:rFonts w:ascii="Anek Devanagari" w:hAnsi="Anek Devanagari"/>
-              <w:b/>
-              <w:color w:val="01373D"/>
-              <w:sz w:val="21"/>
-            </w:rPr>
-            <w:t>Trescon Global Business Solutions Pvt Ltd.</w:t>
-          </w:r>
-        </w:p>
-        <w:p>
-          <w:pPr>
-            <w:spacing w:before="0" w:after="40"/>
-          </w:pPr>
-          <w:r>
-            <w:rPr>
-              <w:rFonts w:ascii="Manrope" w:hAnsi="Manrope"/>
-              <w:color w:val="4A5568"/>
-              <w:sz w:val="17"/>
-            </w:rPr>
-            <w:t>1st floor, Prom’S Complex, 3h, 7th C Main Rd, 3rd Block Koramangala, Bengaluru, Karnataka – 560034</w:t>
-          </w:r>
-        </w:p>
-        <w:p>
-          <w:pPr>
-            <w:spacing w:before="0" w:after="80"/>
-          </w:pPr>
-          <w:r>
-            <w:rPr>
-              <w:rFonts w:ascii="Manrope" w:hAnsi="Manrope"/>
-              <w:color w:val="4A5568"/>
-              <w:sz w:val="16"/>
-            </w:rPr>
-            <w:t>[CIN: U74900KA2016PTC086221]</w:t>
-          </w:r>
-        </w:p>
-      </w:tc>
-    </w:tr>
-  </w:tbl>
   <w:p>
     <w:pPr>
-      <w:spacing w:before="80" w:after="0"/>
       <w:pBdr>
-        <w:top w:val="single" w:sz="6" w:space="4" w:color="DCE3E6"/>
+        <w:top w:val="single" w:sz="12" w:space="1" w:color="00A896"/>
       </w:pBdr>
     </w:pPr>
+  </w:p>
+  <w:p>
     <w:r>
       <w:rPr>
+        <w:rFonts w:ascii="Anek Devanagari" w:hAnsi="Anek Devanagari"/>
+        <w:b/>
+        <w:color w:val="0F4C5C"/>
+        <w:sz w:val="20"/>
+      </w:rPr>
+      <w:t>Trescon Global Business Solutions Pvt Ltd.</w:t>
+    </w:r>
+  </w:p>
+  <w:p>
+    <w:r>
+      <w:rPr>
         <w:rFonts w:ascii="Manrope" w:hAnsi="Manrope"/>
-        <w:b/>
-        <w:color w:val="64748B"/>
-        <w:sz w:val="15"/>
-      </w:rPr>
-      <w:t xml:space="preserve">Disclaimer: </w:t>
+        <w:color w:val="475569"/>
+        <w:sz w:val="17"/>
+      </w:rPr>
+      <w:t>1st floor, Prom'S Complex, 3h, 7th C Main Rd, 3rd Block Koramangala, Bengaluru, Karnataka – 560034</w:t>
+      <w:br/>
+      <w:t>[CIN: U74900KA2016PTC086221]</w:t>
     </w:r>
+  </w:p>
+  <w:p>
+    <w:pPr>
+      <w:spacing w:before="80"/>
+    </w:pPr>
     <w:r>
       <w:rPr>
         <w:rFonts w:ascii="Manrope" w:hAnsi="Manrope"/>
         <w:color w:val="64748B"/>
         <w:sz w:val="15"/>
       </w:rPr>
-      <w:t>The information shared by Trescon is confidential and intended solely for the recipient. It may not be copied, distributed, or relied upon without prior written consent. Trescon makes no warranties regarding the accuracy or completeness of the content and accepts no liability for any loss arising from its use. © 2025 Trescon. All rights reserved.</w:t>
+      <w:t>Disclaimer: The information shared by Trescon is confidential and intended solely for the recipient. It may not be copied, distributed, or relied upon without prior written consent. Trescon makes no warranties regarding accuracy or completeness. © 2026 Trescon. All rights reserved.</w:t>
     </w:r>
   </w:p>
 </w:ftr>
@@ -130,9 +72,9 @@
   <w:p>
     <w:pPr>
       <w:pStyle w:val="Header"/>
-      <w:spacing w:before="0" w:after="160"/>
+      <w:spacing w:before="0" w:after="200"/>
       <w:pBdr>
-        <w:bottom w:val="single" w:sz="36" w:space="0" w:color="01373D"/>
+        <w:top w:val="single" w:sz="36" w:space="0" w:color="053B3F"/>
       </w:pBdr>
     </w:pPr>
   </w:p>
@@ -152,13 +94,14 @@
       </w:tblBorders>
     </w:tblPr>
     <w:tblGrid>
-      <w:gridCol w:w="7370"/>
+      <w:gridCol w:w="3685"/>
+      <w:gridCol w:w="3685"/>
       <w:gridCol w:w="3402"/>
     </w:tblGrid>
     <w:tr>
       <w:tc>
         <w:tcPr>
-          <w:tcW w:type="dxa" w:w="7370"/>
+          <w:tcW w:type="dxa" w:w="3685"/>
           <w:tcBorders>
             <w:top w:val="none"/>
             <w:left w:val="none"/>
@@ -167,10 +110,6 @@
           </w:tcBorders>
         </w:tcPr>
         <w:p>
-          <w:pPr>
-            <w:spacing w:after="0"/>
-            <w:jc w:val="left"/>
-          </w:pPr>
           <w:r>
             <w:drawing>
               <wp:inline xmlns:a="http://schemas.openxmlformats.org/drawingml/2006/main" xmlns:pic="http://schemas.openxmlformats.org/drawingml/2006/picture">
@@ -209,6 +148,39 @@
       </w:tc>
       <w:tc>
         <w:tcPr>
+          <w:tcW w:type="dxa" w:w="3685"/>
+          <w:tcBorders>
+            <w:top w:val="none"/>
+            <w:left w:val="none"/>
+            <w:bottom w:val="none"/>
+            <w:right w:val="none"/>
+          </w:tcBorders>
+          <w:tcBorders>
+            <w:top w:val="none"/>
+            <w:left w:val="single" w:sz="8" w:space="0" w:color="00A5A3"/>
+            <w:bottom w:val="none"/>
+            <w:right w:val="none"/>
+          </w:tcBorders>
+        </w:tcPr>
+        <w:p>
+          <w:pPr>
+            <w:spacing w:before="80"/>
+          </w:pPr>
+          <w:r>
+            <w:rPr>
+              <w:rFonts w:ascii="Manrope" w:hAnsi="Manrope"/>
+              <w:b/>
+              <w:color w:val="0F4C5C"/>
+              <w:sz w:val="19"/>
+            </w:rPr>
+            <w:t xml:space="preserve">  Connecting Businesses</w:t>
+            <w:br/>
+            <w:t xml:space="preserve">  with Opportunities</w:t>
+          </w:r>
+        </w:p>
+      </w:tc>
+      <w:tc>
+        <w:tcPr>
           <w:tcW w:type="dxa" w:w="3402"/>
           <w:tcBorders>
             <w:top w:val="none"/>
@@ -219,21 +191,21 @@
         </w:tcPr>
         <w:p>
           <w:pPr>
-            <w:spacing w:before="160" w:after="0"/>
             <w:jc w:val="right"/>
           </w:pPr>
           <w:r>
             <w:rPr>
               <w:rFonts w:ascii="Segoe UI Symbol" w:hAnsi="Segoe UI Symbol"/>
-              <w:color w:val="00A5A3"/>
-              <w:sz w:val="18"/>
+              <w:color w:val="00A896"/>
+              <w:sz w:val="19"/>
             </w:rPr>
             <w:t xml:space="preserve">✉ </w:t>
           </w:r>
           <w:r>
             <w:rPr>
               <w:rFonts w:ascii="Manrope" w:hAnsi="Manrope"/>
-              <w:color w:val="464D53"/>
+              <w:b/>
+              <w:color w:val="334155"/>
               <w:sz w:val="18"/>
             </w:rPr>
             <w:t>info@tresconglobal.com</w:t>
@@ -242,8 +214,8 @@
           <w:r>
             <w:rPr>
               <w:rFonts w:ascii="Segoe UI Symbol" w:hAnsi="Segoe UI Symbol"/>
-              <w:color w:val="00A5A3"/>
-              <w:sz w:val="18"/>
+              <w:color w:val="00A896"/>
+              <w:sz w:val="19"/>
             </w:rPr>
             <w:t xml:space="preserve">🌐 </w:t>
           </w:r>
@@ -251,7 +223,7 @@
             <w:rPr>
               <w:rFonts w:ascii="Manrope" w:hAnsi="Manrope"/>
               <w:b/>
-              <w:color w:val="00A5A3"/>
+              <w:color w:val="00A896"/>
               <w:sz w:val="18"/>
             </w:rPr>
             <w:t>tresconglobal.com</w:t>
@@ -262,9 +234,9 @@
   </w:tbl>
   <w:p>
     <w:pPr>
-      <w:spacing w:before="160" w:after="0"/>
+      <w:spacing w:before="120"/>
       <w:pBdr>
-        <w:bottom w:val="single" w:sz="12" w:space="1" w:color="00A5A3"/>
+        <w:bottom w:val="single" w:sz="18" w:space="1" w:color="8DC63F"/>
       </w:pBdr>
     </w:pPr>
   </w:p>

</xml_diff>

<commit_message>
Permanently remove tagline 'Connecting Businesses with Opportunities' and vertical divider across all Word templates and web studio
</commit_message>
<xml_diff>
--- a/Trescon_Global_Letterhead_Template.docx
+++ b/Trescon_Global_Letterhead_Template.docx
@@ -94,14 +94,13 @@
       </w:tblBorders>
     </w:tblPr>
     <w:tblGrid>
-      <w:gridCol w:w="3685"/>
-      <w:gridCol w:w="3685"/>
+      <w:gridCol w:w="7370"/>
       <w:gridCol w:w="3402"/>
     </w:tblGrid>
     <w:tr>
       <w:tc>
         <w:tcPr>
-          <w:tcW w:type="dxa" w:w="3685"/>
+          <w:tcW w:type="dxa" w:w="7370"/>
           <w:tcBorders>
             <w:top w:val="none"/>
             <w:left w:val="none"/>
@@ -110,6 +109,10 @@
           </w:tcBorders>
         </w:tcPr>
         <w:p>
+          <w:pPr>
+            <w:spacing w:after="0"/>
+            <w:jc w:val="left"/>
+          </w:pPr>
           <w:r>
             <w:drawing>
               <wp:inline xmlns:a="http://schemas.openxmlformats.org/drawingml/2006/main" xmlns:pic="http://schemas.openxmlformats.org/drawingml/2006/picture">
@@ -148,39 +151,6 @@
       </w:tc>
       <w:tc>
         <w:tcPr>
-          <w:tcW w:type="dxa" w:w="3685"/>
-          <w:tcBorders>
-            <w:top w:val="none"/>
-            <w:left w:val="none"/>
-            <w:bottom w:val="none"/>
-            <w:right w:val="none"/>
-          </w:tcBorders>
-          <w:tcBorders>
-            <w:top w:val="none"/>
-            <w:left w:val="single" w:sz="8" w:space="0" w:color="00A5A3"/>
-            <w:bottom w:val="none"/>
-            <w:right w:val="none"/>
-          </w:tcBorders>
-        </w:tcPr>
-        <w:p>
-          <w:pPr>
-            <w:spacing w:before="80"/>
-          </w:pPr>
-          <w:r>
-            <w:rPr>
-              <w:rFonts w:ascii="Manrope" w:hAnsi="Manrope"/>
-              <w:b/>
-              <w:color w:val="0F4C5C"/>
-              <w:sz w:val="19"/>
-            </w:rPr>
-            <w:t xml:space="preserve">  Connecting Businesses</w:t>
-            <w:br/>
-            <w:t xml:space="preserve">  with Opportunities</w:t>
-          </w:r>
-        </w:p>
-      </w:tc>
-      <w:tc>
-        <w:tcPr>
           <w:tcW w:type="dxa" w:w="3402"/>
           <w:tcBorders>
             <w:top w:val="none"/>
@@ -191,6 +161,7 @@
         </w:tcPr>
         <w:p>
           <w:pPr>
+            <w:spacing w:before="80"/>
             <w:jc w:val="right"/>
           </w:pPr>
           <w:r>

</xml_diff>

<commit_message>
Update generate_word_template.py script to reuse existing header paragraph for flush top accent bar and 32mm body top clearance
</commit_message>
<xml_diff>
--- a/Trescon_Global_Letterhead_Template.docx
+++ b/Trescon_Global_Letterhead_Template.docx
@@ -6,7 +6,7 @@
       <w:headerReference w:type="default" r:id="rId9"/>
       <w:footerReference w:type="default" r:id="rId10"/>
       <w:pgSz w:w="11906" w:h="16838"/>
-      <w:pgMar w:top="1587" w:right="567" w:bottom="1417" w:left="567" w:header="0" w:footer="720" w:gutter="0"/>
+      <w:pgMar w:top="1814" w:right="567" w:bottom="1417" w:left="567" w:header="0" w:footer="720" w:gutter="0"/>
       <w:cols w:space="720"/>
       <w:docGrid w:linePitch="360"/>
     </w:sectPr>
@@ -19,10 +19,6 @@
   <w:p>
     <w:pPr>
       <w:pStyle w:val="Footer"/>
-    </w:pPr>
-  </w:p>
-  <w:p>
-    <w:pPr>
       <w:pBdr>
         <w:top w:val="single" w:sz="12" w:space="1" w:color="00A896"/>
       </w:pBdr>
@@ -72,11 +68,12 @@
   <w:p>
     <w:pPr>
       <w:pStyle w:val="Header"/>
-      <w:spacing w:before="0" w:after="200"/>
+      <w:spacing w:before="0" w:after="120" w:line="40" w:lineRule="exact"/>
       <w:pBdr>
         <w:top w:val="single" w:sz="36" w:space="0" w:color="053B3F"/>
       </w:pBdr>
     </w:pPr>
+    <w:r/>
   </w:p>
   <w:tbl>
     <w:tblPr>
@@ -94,13 +91,14 @@
       </w:tblBorders>
     </w:tblPr>
     <w:tblGrid>
-      <w:gridCol w:w="7370"/>
+      <w:gridCol w:w="3685"/>
+      <w:gridCol w:w="3685"/>
       <w:gridCol w:w="3402"/>
     </w:tblGrid>
     <w:tr>
       <w:tc>
         <w:tcPr>
-          <w:tcW w:type="dxa" w:w="7370"/>
+          <w:tcW w:type="dxa" w:w="3685"/>
           <w:tcBorders>
             <w:top w:val="none"/>
             <w:left w:val="none"/>
@@ -109,10 +107,6 @@
           </w:tcBorders>
         </w:tcPr>
         <w:p>
-          <w:pPr>
-            <w:spacing w:after="0"/>
-            <w:jc w:val="left"/>
-          </w:pPr>
           <w:r>
             <w:drawing>
               <wp:inline xmlns:a="http://schemas.openxmlformats.org/drawingml/2006/main" xmlns:pic="http://schemas.openxmlformats.org/drawingml/2006/picture">
@@ -151,6 +145,39 @@
       </w:tc>
       <w:tc>
         <w:tcPr>
+          <w:tcW w:type="dxa" w:w="3685"/>
+          <w:tcBorders>
+            <w:top w:val="none"/>
+            <w:left w:val="none"/>
+            <w:bottom w:val="none"/>
+            <w:right w:val="none"/>
+          </w:tcBorders>
+          <w:tcBorders>
+            <w:top w:val="none"/>
+            <w:left w:val="single" w:sz="8" w:space="0" w:color="00A5A3"/>
+            <w:bottom w:val="none"/>
+            <w:right w:val="none"/>
+          </w:tcBorders>
+        </w:tcPr>
+        <w:p>
+          <w:pPr>
+            <w:spacing w:before="80"/>
+          </w:pPr>
+          <w:r>
+            <w:rPr>
+              <w:rFonts w:ascii="Manrope" w:hAnsi="Manrope"/>
+              <w:b/>
+              <w:color w:val="0F4C5C"/>
+              <w:sz w:val="19"/>
+            </w:rPr>
+            <w:t xml:space="preserve">  Connecting Businesses</w:t>
+            <w:br/>
+            <w:t xml:space="preserve">  with Opportunities</w:t>
+          </w:r>
+        </w:p>
+      </w:tc>
+      <w:tc>
+        <w:tcPr>
           <w:tcW w:type="dxa" w:w="3402"/>
           <w:tcBorders>
             <w:top w:val="none"/>
@@ -161,7 +188,6 @@
         </w:tcPr>
         <w:p>
           <w:pPr>
-            <w:spacing w:before="80"/>
             <w:jc w:val="right"/>
           </w:pPr>
           <w:r>
@@ -205,7 +231,7 @@
   </w:tbl>
   <w:p>
     <w:pPr>
-      <w:spacing w:before="120"/>
+      <w:spacing w:before="80" w:after="0"/>
       <w:pBdr>
         <w:bottom w:val="single" w:sz="18" w:space="1" w:color="8DC63F"/>
       </w:pBdr>

</xml_diff>

<commit_message>
Permanently lock 2-column header without tagline text since logo graphic contains tagline
</commit_message>
<xml_diff>
--- a/Trescon_Global_Letterhead_Template.docx
+++ b/Trescon_Global_Letterhead_Template.docx
@@ -91,14 +91,13 @@
       </w:tblBorders>
     </w:tblPr>
     <w:tblGrid>
-      <w:gridCol w:w="3685"/>
-      <w:gridCol w:w="3685"/>
+      <w:gridCol w:w="7370"/>
       <w:gridCol w:w="3402"/>
     </w:tblGrid>
     <w:tr>
       <w:tc>
         <w:tcPr>
-          <w:tcW w:type="dxa" w:w="3685"/>
+          <w:tcW w:type="dxa" w:w="7370"/>
           <w:tcBorders>
             <w:top w:val="none"/>
             <w:left w:val="none"/>
@@ -107,6 +106,10 @@
           </w:tcBorders>
         </w:tcPr>
         <w:p>
+          <w:pPr>
+            <w:spacing w:after="0"/>
+            <w:jc w:val="left"/>
+          </w:pPr>
           <w:r>
             <w:drawing>
               <wp:inline xmlns:a="http://schemas.openxmlformats.org/drawingml/2006/main" xmlns:pic="http://schemas.openxmlformats.org/drawingml/2006/picture">
@@ -145,39 +148,6 @@
       </w:tc>
       <w:tc>
         <w:tcPr>
-          <w:tcW w:type="dxa" w:w="3685"/>
-          <w:tcBorders>
-            <w:top w:val="none"/>
-            <w:left w:val="none"/>
-            <w:bottom w:val="none"/>
-            <w:right w:val="none"/>
-          </w:tcBorders>
-          <w:tcBorders>
-            <w:top w:val="none"/>
-            <w:left w:val="single" w:sz="8" w:space="0" w:color="00A5A3"/>
-            <w:bottom w:val="none"/>
-            <w:right w:val="none"/>
-          </w:tcBorders>
-        </w:tcPr>
-        <w:p>
-          <w:pPr>
-            <w:spacing w:before="80"/>
-          </w:pPr>
-          <w:r>
-            <w:rPr>
-              <w:rFonts w:ascii="Manrope" w:hAnsi="Manrope"/>
-              <w:b/>
-              <w:color w:val="0F4C5C"/>
-              <w:sz w:val="19"/>
-            </w:rPr>
-            <w:t xml:space="preserve">  Connecting Businesses</w:t>
-            <w:br/>
-            <w:t xml:space="preserve">  with Opportunities</w:t>
-          </w:r>
-        </w:p>
-      </w:tc>
-      <w:tc>
-        <w:tcPr>
           <w:tcW w:type="dxa" w:w="3402"/>
           <w:tcBorders>
             <w:top w:val="none"/>
@@ -188,6 +158,7 @@
         </w:tcPr>
         <w:p>
           <w:pPr>
+            <w:spacing w:before="80"/>
             <w:jc w:val="right"/>
           </w:pPr>
           <w:r>

</xml_diff>

<commit_message>
Add Flush Full-Bleed Top Accent Bar Table with -567 dxa negative left indent into generate_word_template.py
</commit_message>
<xml_diff>
--- a/Trescon_Global_Letterhead_Template.docx
+++ b/Trescon_Global_Letterhead_Template.docx
@@ -68,13 +68,45 @@
   <w:p>
     <w:pPr>
       <w:pStyle w:val="Header"/>
-      <w:spacing w:before="0" w:after="120" w:line="40" w:lineRule="exact"/>
-      <w:pBdr>
-        <w:top w:val="single" w:sz="36" w:space="0" w:color="053B3F"/>
-      </w:pBdr>
-    </w:pPr>
-    <w:r/>
+    </w:pPr>
   </w:p>
+  <w:tbl>
+    <w:tblPr>
+      <w:tblW w:type="auto" w:w="0"/>
+      <w:jc w:val="center"/>
+      <w:tblLayout w:type="fixed"/>
+      <w:tblLook w:firstColumn="1" w:firstRow="1" w:lastColumn="0" w:lastRow="0" w:noHBand="0" w:noVBand="1" w:val="04A0"/>
+      <w:tblCellMar>
+        <w:left w:w="0" w:type="dxa"/>
+        <w:right w:w="0" w:type="dxa"/>
+      </w:tblCellMar>
+      <w:tblInd w:w="-567" w:type="dxa"/>
+      <w:tblBorders>
+        <w:top w:val="none"/>
+        <w:left w:val="none"/>
+        <w:bottom w:val="none"/>
+        <w:right w:val="none"/>
+        <w:insideH w:val="none"/>
+        <w:insideV w:val="none"/>
+      </w:tblBorders>
+    </w:tblPr>
+    <w:tblGrid>
+      <w:gridCol w:w="11906"/>
+    </w:tblGrid>
+    <w:tr>
+      <w:tc>
+        <w:tcPr>
+          <w:tcW w:type="dxa" w:w="11906"/>
+          <w:shd w:fill="053B3F"/>
+        </w:tcPr>
+        <w:p>
+          <w:pPr>
+            <w:spacing w:before="0" w:after="0" w:line="60" w:lineRule="exact"/>
+          </w:pPr>
+        </w:p>
+      </w:tc>
+    </w:tr>
+  </w:tbl>
   <w:tbl>
     <w:tblPr>
       <w:tblW w:type="auto" w:w="0"/>
@@ -107,7 +139,7 @@
         </w:tcPr>
         <w:p>
           <w:pPr>
-            <w:spacing w:after="0"/>
+            <w:spacing w:before="160" w:after="0"/>
             <w:jc w:val="left"/>
           </w:pPr>
           <w:r>
@@ -158,7 +190,7 @@
         </w:tcPr>
         <w:p>
           <w:pPr>
-            <w:spacing w:before="80"/>
+            <w:spacing w:before="240"/>
             <w:jc w:val="right"/>
           </w:pPr>
           <w:r>
@@ -202,7 +234,7 @@
   </w:tbl>
   <w:p>
     <w:pPr>
-      <w:spacing w:before="80" w:after="0"/>
+      <w:spacing w:before="120" w:after="0"/>
       <w:pBdr>
         <w:bottom w:val="single" w:sz="18" w:space="1" w:color="8DC63F"/>
       </w:pBdr>

</xml_diff>

<commit_message>
Update Word template generator: zero-gap top bar table, 4pt height dark teal fill, 15mm margins, and 2-column tagline-free layout
</commit_message>
<xml_diff>
--- a/Trescon_Global_Letterhead_Template.docx
+++ b/Trescon_Global_Letterhead_Template.docx
@@ -6,7 +6,7 @@
       <w:headerReference w:type="default" r:id="rId9"/>
       <w:footerReference w:type="default" r:id="rId10"/>
       <w:pgSz w:w="11906" w:h="16838"/>
-      <w:pgMar w:top="1814" w:right="567" w:bottom="1417" w:left="567" w:header="0" w:footer="720" w:gutter="0"/>
+      <w:pgMar w:top="1587" w:right="850" w:bottom="1417" w:left="850" w:header="0" w:footer="720" w:gutter="0"/>
       <w:cols w:space="720"/>
       <w:docGrid w:linePitch="360"/>
     </w:sectPr>
@@ -19,15 +19,24 @@
   <w:p>
     <w:pPr>
       <w:pStyle w:val="Footer"/>
-      <w:pBdr>
-        <w:top w:val="single" w:sz="12" w:space="1" w:color="00A896"/>
-      </w:pBdr>
-    </w:pPr>
+    </w:pPr>
+    <w:r/>
   </w:p>
   <w:p>
+    <w:pPr>
+      <w:spacing w:before="0" w:after="80"/>
+      <w:pBdr>
+        <w:top w:val="single" w:sz="12" w:space="0" w:color="00A896"/>
+      </w:pBdr>
+    </w:pPr>
+  </w:p>
+  <w:p>
+    <w:pPr>
+      <w:spacing w:before="80" w:after="40"/>
+    </w:pPr>
     <w:r>
       <w:rPr>
-        <w:rFonts w:ascii="Anek Devanagari" w:hAnsi="Anek Devanagari"/>
+        <w:rFonts w:ascii="Manrope" w:hAnsi="Manrope"/>
         <w:b/>
         <w:color w:val="0F4C5C"/>
         <w:sz w:val="20"/>
@@ -36,6 +45,9 @@
     </w:r>
   </w:p>
   <w:p>
+    <w:pPr>
+      <w:spacing w:before="0" w:after="40"/>
+    </w:pPr>
     <w:r>
       <w:rPr>
         <w:rFonts w:ascii="Manrope" w:hAnsi="Manrope"/>
@@ -43,19 +55,26 @@
         <w:sz w:val="17"/>
       </w:rPr>
       <w:t>1st floor, Prom'S Complex, 3h, 7th C Main Rd, 3rd Block Koramangala, Bengaluru, Karnataka – 560034</w:t>
+    </w:r>
+    <w:r>
+      <w:rPr>
+        <w:rFonts w:ascii="Manrope" w:hAnsi="Manrope"/>
+        <w:color w:val="475569"/>
+        <w:sz w:val="16"/>
+      </w:rPr>
       <w:br/>
       <w:t>[CIN: U74900KA2016PTC086221]</w:t>
     </w:r>
   </w:p>
   <w:p>
     <w:pPr>
-      <w:spacing w:before="80"/>
+      <w:spacing w:before="80" w:after="0"/>
     </w:pPr>
     <w:r>
       <w:rPr>
         <w:rFonts w:ascii="Manrope" w:hAnsi="Manrope"/>
         <w:color w:val="64748B"/>
-        <w:sz w:val="15"/>
+        <w:sz w:val="14"/>
       </w:rPr>
       <w:t>Disclaimer: The information shared by Trescon is confidential and intended solely for the recipient. It may not be copied, distributed, or relied upon without prior written consent. Trescon makes no warranties regarding accuracy or completeness. © 2026 Trescon. All rights reserved.</w:t>
     </w:r>
@@ -68,7 +87,9 @@
   <w:p>
     <w:pPr>
       <w:pStyle w:val="Header"/>
-    </w:pPr>
+      <w:spacing w:before="0" w:after="0" w:line="20" w:lineRule="exact"/>
+    </w:pPr>
+    <w:r/>
   </w:p>
   <w:tbl>
     <w:tblPr>
@@ -76,18 +97,14 @@
       <w:jc w:val="center"/>
       <w:tblLayout w:type="fixed"/>
       <w:tblLook w:firstColumn="1" w:firstRow="1" w:lastColumn="0" w:lastRow="0" w:noHBand="0" w:noVBand="1" w:val="04A0"/>
-      <w:tblCellMar>
-        <w:left w:w="0" w:type="dxa"/>
-        <w:right w:w="0" w:type="dxa"/>
-      </w:tblCellMar>
-      <w:tblInd w:w="-567" w:type="dxa"/>
+      <w:tblInd w:w="-850" w:type="dxa"/>
       <w:tblBorders>
-        <w:top w:val="none"/>
-        <w:left w:val="none"/>
-        <w:bottom w:val="none"/>
-        <w:right w:val="none"/>
-        <w:insideH w:val="none"/>
-        <w:insideV w:val="none"/>
+        <w:top w:val="none" w:sz="0"/>
+        <w:left w:val="none" w:sz="0"/>
+        <w:bottom w:val="none" w:sz="0"/>
+        <w:right w:val="none" w:sz="0"/>
+        <w:insideH w:val="none" w:sz="0"/>
+        <w:insideV w:val="none" w:sz="0"/>
       </w:tblBorders>
     </w:tblPr>
     <w:tblGrid>
@@ -101,12 +118,23 @@
         </w:tcPr>
         <w:p>
           <w:pPr>
-            <w:spacing w:before="0" w:after="0" w:line="60" w:lineRule="exact"/>
+            <w:spacing w:before="0" w:after="0" w:line="20" w:lineRule="exact"/>
           </w:pPr>
+          <w:r>
+            <w:rPr>
+              <w:sz w:val="8"/>
+            </w:rPr>
+            <w:t xml:space="preserve"> </w:t>
+          </w:r>
         </w:p>
       </w:tc>
     </w:tr>
   </w:tbl>
+  <w:p>
+    <w:pPr>
+      <w:spacing w:before="120" w:after="0" w:line="20" w:lineRule="exact"/>
+    </w:pPr>
+  </w:p>
   <w:tbl>
     <w:tblPr>
       <w:tblW w:type="auto" w:w="0"/>
@@ -114,32 +142,27 @@
       <w:tblLayout w:type="fixed"/>
       <w:tblLook w:firstColumn="1" w:firstRow="1" w:lastColumn="0" w:lastRow="0" w:noHBand="0" w:noVBand="1" w:val="04A0"/>
       <w:tblBorders>
-        <w:top w:val="none"/>
-        <w:left w:val="none"/>
-        <w:bottom w:val="none"/>
-        <w:right w:val="none"/>
-        <w:insideH w:val="none"/>
-        <w:insideV w:val="none"/>
+        <w:top w:val="none" w:sz="0"/>
+        <w:left w:val="none" w:sz="0"/>
+        <w:bottom w:val="none" w:sz="0"/>
+        <w:right w:val="none" w:sz="0"/>
+        <w:insideH w:val="none" w:sz="0"/>
+        <w:insideV w:val="none" w:sz="0"/>
       </w:tblBorders>
     </w:tblPr>
     <w:tblGrid>
-      <w:gridCol w:w="7370"/>
+      <w:gridCol w:w="6803"/>
       <w:gridCol w:w="3402"/>
     </w:tblGrid>
     <w:tr>
       <w:tc>
         <w:tcPr>
-          <w:tcW w:type="dxa" w:w="7370"/>
-          <w:tcBorders>
-            <w:top w:val="none"/>
-            <w:left w:val="none"/>
-            <w:bottom w:val="none"/>
-            <w:right w:val="none"/>
-          </w:tcBorders>
+          <w:tcW w:type="dxa" w:w="6803"/>
+          <w:vAlign w:val="center"/>
         </w:tcPr>
         <w:p>
           <w:pPr>
-            <w:spacing w:before="160" w:after="0"/>
+            <w:spacing w:before="0" w:after="0"/>
             <w:jc w:val="left"/>
           </w:pPr>
           <w:r>
@@ -181,52 +204,29 @@
       <w:tc>
         <w:tcPr>
           <w:tcW w:type="dxa" w:w="3402"/>
-          <w:tcBorders>
-            <w:top w:val="none"/>
-            <w:left w:val="none"/>
-            <w:bottom w:val="none"/>
-            <w:right w:val="none"/>
-          </w:tcBorders>
+          <w:vAlign w:val="center"/>
         </w:tcPr>
         <w:p>
           <w:pPr>
-            <w:spacing w:before="240"/>
+            <w:spacing w:before="0" w:after="0"/>
             <w:jc w:val="right"/>
           </w:pPr>
           <w:r>
             <w:rPr>
-              <w:rFonts w:ascii="Segoe UI Symbol" w:hAnsi="Segoe UI Symbol"/>
-              <w:color w:val="00A896"/>
-              <w:sz w:val="19"/>
-            </w:rPr>
-            <w:t xml:space="preserve">✉ </w:t>
-          </w:r>
-          <w:r>
-            <w:rPr>
-              <w:rFonts w:ascii="Manrope" w:hAnsi="Manrope"/>
-              <w:b/>
-              <w:color w:val="334155"/>
+              <w:rFonts w:ascii="Segoe UI" w:hAnsi="Segoe UI"/>
+              <w:color w:val="0F4C5C"/>
               <w:sz w:val="18"/>
             </w:rPr>
-            <w:t>info@tresconglobal.com</w:t>
+            <w:t>✉ info@tresconglobal.com</w:t>
             <w:br/>
           </w:r>
           <w:r>
             <w:rPr>
-              <w:rFonts w:ascii="Segoe UI Symbol" w:hAnsi="Segoe UI Symbol"/>
-              <w:color w:val="00A896"/>
-              <w:sz w:val="19"/>
-            </w:rPr>
-            <w:t xml:space="preserve">🌐 </w:t>
-          </w:r>
-          <w:r>
-            <w:rPr>
-              <w:rFonts w:ascii="Manrope" w:hAnsi="Manrope"/>
-              <w:b/>
-              <w:color w:val="00A896"/>
+              <w:rFonts w:ascii="Segoe UI" w:hAnsi="Segoe UI"/>
+              <w:color w:val="0F4C5C"/>
               <w:sz w:val="18"/>
             </w:rPr>
-            <w:t>tresconglobal.com</w:t>
+            <w:t>🌐 tresconglobal.com</w:t>
           </w:r>
         </w:p>
       </w:tc>
@@ -234,9 +234,9 @@
   </w:tbl>
   <w:p>
     <w:pPr>
-      <w:spacing w:before="120" w:after="0"/>
+      <w:spacing w:before="80" w:after="0" w:line="20" w:lineRule="exact"/>
       <w:pBdr>
-        <w:bottom w:val="single" w:sz="18" w:space="1" w:color="8DC63F"/>
+        <w:bottom w:val="single" w:sz="18" w:space="0" w:color="8DC63F"/>
       </w:pBdr>
     </w:pPr>
   </w:p>

</xml_diff>

<commit_message>
Update generate_word_template.py with user-provided centered header/footer script and lime green bottom border
</commit_message>
<xml_diff>
--- a/Trescon_Global_Letterhead_Template.docx
+++ b/Trescon_Global_Letterhead_Template.docx
@@ -6,7 +6,7 @@
       <w:headerReference w:type="default" r:id="rId9"/>
       <w:footerReference w:type="default" r:id="rId10"/>
       <w:pgSz w:w="11906" w:h="16838"/>
-      <w:pgMar w:top="1587" w:right="850" w:bottom="1417" w:left="850" w:header="0" w:footer="720" w:gutter="0"/>
+      <w:pgMar w:top="1417" w:right="850" w:bottom="1417" w:left="850" w:header="0" w:footer="720" w:gutter="0"/>
       <w:cols w:space="720"/>
       <w:docGrid w:linePitch="360"/>
     </w:sectPr>
@@ -24,19 +24,21 @@
   </w:p>
   <w:p>
     <w:pPr>
-      <w:spacing w:before="0" w:after="80"/>
+      <w:spacing w:before="0" w:after="40"/>
       <w:pBdr>
         <w:top w:val="single" w:sz="12" w:space="0" w:color="00A896"/>
       </w:pBdr>
     </w:pPr>
+    <w:r/>
   </w:p>
   <w:p>
     <w:pPr>
-      <w:spacing w:before="80" w:after="40"/>
+      <w:spacing w:before="80" w:after="0"/>
+      <w:jc w:val="center"/>
     </w:pPr>
     <w:r>
       <w:rPr>
-        <w:rFonts w:ascii="Manrope" w:hAnsi="Manrope"/>
+        <w:rFonts w:ascii="Calibri" w:hAnsi="Calibri"/>
         <w:b/>
         <w:color w:val="0F4C5C"/>
         <w:sz w:val="20"/>
@@ -46,33 +48,40 @@
   </w:p>
   <w:p>
     <w:pPr>
-      <w:spacing w:before="0" w:after="40"/>
+      <w:spacing w:before="0" w:after="0"/>
+      <w:jc w:val="center"/>
     </w:pPr>
     <w:r>
       <w:rPr>
-        <w:rFonts w:ascii="Manrope" w:hAnsi="Manrope"/>
+        <w:rFonts w:ascii="Calibri" w:hAnsi="Calibri"/>
         <w:color w:val="475569"/>
         <w:sz w:val="17"/>
       </w:rPr>
       <w:t>1st floor, Prom'S Complex, 3h, 7th C Main Rd, 3rd Block Koramangala, Bengaluru, Karnataka – 560034</w:t>
     </w:r>
+  </w:p>
+  <w:p>
+    <w:pPr>
+      <w:spacing w:before="0" w:after="80"/>
+      <w:jc w:val="center"/>
+    </w:pPr>
     <w:r>
       <w:rPr>
-        <w:rFonts w:ascii="Manrope" w:hAnsi="Manrope"/>
+        <w:rFonts w:ascii="Calibri" w:hAnsi="Calibri"/>
         <w:color w:val="475569"/>
         <w:sz w:val="16"/>
       </w:rPr>
-      <w:br/>
       <w:t>[CIN: U74900KA2016PTC086221]</w:t>
     </w:r>
   </w:p>
   <w:p>
     <w:pPr>
       <w:spacing w:before="80" w:after="0"/>
+      <w:jc w:val="center"/>
     </w:pPr>
     <w:r>
       <w:rPr>
-        <w:rFonts w:ascii="Manrope" w:hAnsi="Manrope"/>
+        <w:rFonts w:ascii="Calibri" w:hAnsi="Calibri"/>
         <w:color w:val="64748B"/>
         <w:sz w:val="14"/>
       </w:rPr>
@@ -87,158 +96,115 @@
   <w:p>
     <w:pPr>
       <w:pStyle w:val="Header"/>
-      <w:spacing w:before="0" w:after="0" w:line="20" w:lineRule="exact"/>
     </w:pPr>
     <w:r/>
   </w:p>
-  <w:tbl>
-    <w:tblPr>
-      <w:tblW w:type="auto" w:w="0"/>
+  <w:p>
+    <w:pPr>
+      <w:spacing w:before="0" w:after="0"/>
+      <w:pBdr>
+        <w:top w:val="single" w:sz="24" w:space="0" w:color="053B3F"/>
+      </w:pBdr>
+    </w:pPr>
+    <w:r/>
+  </w:p>
+  <w:p>
+    <w:pPr>
+      <w:spacing w:before="200" w:after="0"/>
+    </w:pPr>
+  </w:p>
+  <w:p>
+    <w:pPr>
+      <w:spacing w:before="0" w:after="0"/>
       <w:jc w:val="center"/>
-      <w:tblLayout w:type="fixed"/>
-      <w:tblLook w:firstColumn="1" w:firstRow="1" w:lastColumn="0" w:lastRow="0" w:noHBand="0" w:noVBand="1" w:val="04A0"/>
-      <w:tblInd w:w="-850" w:type="dxa"/>
-      <w:tblBorders>
-        <w:top w:val="none" w:sz="0"/>
-        <w:left w:val="none" w:sz="0"/>
-        <w:bottom w:val="none" w:sz="0"/>
-        <w:right w:val="none" w:sz="0"/>
-        <w:insideH w:val="none" w:sz="0"/>
-        <w:insideV w:val="none" w:sz="0"/>
-      </w:tblBorders>
-    </w:tblPr>
-    <w:tblGrid>
-      <w:gridCol w:w="11906"/>
-    </w:tblGrid>
-    <w:tr>
-      <w:tc>
-        <w:tcPr>
-          <w:tcW w:type="dxa" w:w="11906"/>
-          <w:shd w:fill="053B3F"/>
-        </w:tcPr>
-        <w:p>
-          <w:pPr>
-            <w:spacing w:before="0" w:after="0" w:line="20" w:lineRule="exact"/>
-          </w:pPr>
-          <w:r>
-            <w:rPr>
-              <w:sz w:val="8"/>
-            </w:rPr>
-            <w:t xml:space="preserve"> </w:t>
-          </w:r>
-        </w:p>
-      </w:tc>
-    </w:tr>
-  </w:tbl>
+    </w:pPr>
+    <w:r>
+      <w:drawing>
+        <wp:inline xmlns:a="http://schemas.openxmlformats.org/drawingml/2006/main" xmlns:pic="http://schemas.openxmlformats.org/drawingml/2006/picture">
+          <wp:extent cx="2509120" cy="571500"/>
+          <wp:docPr id="1" name="Picture 1"/>
+          <wp:cNvGraphicFramePr>
+            <a:graphicFrameLocks noChangeAspect="1"/>
+          </wp:cNvGraphicFramePr>
+          <a:graphic>
+            <a:graphicData uri="http://schemas.openxmlformats.org/drawingml/2006/picture">
+              <pic:pic>
+                <pic:nvPicPr>
+                  <pic:cNvPr id="0" name="10-years-trescon-logo.png"/>
+                  <pic:cNvPicPr/>
+                </pic:nvPicPr>
+                <pic:blipFill>
+                  <a:blip r:embed="rId1"/>
+                  <a:stretch>
+                    <a:fillRect/>
+                  </a:stretch>
+                </pic:blipFill>
+                <pic:spPr>
+                  <a:xfrm>
+                    <a:off x="0" y="0"/>
+                    <a:ext cx="2509120" cy="571500"/>
+                  </a:xfrm>
+                  <a:prstGeom prst="rect"/>
+                </pic:spPr>
+              </pic:pic>
+            </a:graphicData>
+          </a:graphic>
+        </wp:inline>
+      </w:drawing>
+    </w:r>
+  </w:p>
   <w:p>
     <w:pPr>
-      <w:spacing w:before="120" w:after="0" w:line="20" w:lineRule="exact"/>
-    </w:pPr>
+      <w:spacing w:before="40" w:after="0"/>
+      <w:jc w:val="center"/>
+    </w:pPr>
+    <w:r>
+      <w:rPr>
+        <w:rFonts w:ascii="Calibri" w:hAnsi="Calibri"/>
+        <w:b/>
+        <w:i/>
+        <w:color w:val="053B3F"/>
+        <w:sz w:val="24"/>
+      </w:rPr>
+      <w:t>Connecting Businesses with Opportunities</w:t>
+    </w:r>
   </w:p>
-  <w:tbl>
-    <w:tblPr>
-      <w:tblW w:type="auto" w:w="0"/>
-      <w:jc w:val="center"/>
-      <w:tblLayout w:type="fixed"/>
-      <w:tblLook w:firstColumn="1" w:firstRow="1" w:lastColumn="0" w:lastRow="0" w:noHBand="0" w:noVBand="1" w:val="04A0"/>
-      <w:tblBorders>
-        <w:top w:val="none" w:sz="0"/>
-        <w:left w:val="none" w:sz="0"/>
-        <w:bottom w:val="none" w:sz="0"/>
-        <w:right w:val="none" w:sz="0"/>
-        <w:insideH w:val="none" w:sz="0"/>
-        <w:insideV w:val="none" w:sz="0"/>
-      </w:tblBorders>
-    </w:tblPr>
-    <w:tblGrid>
-      <w:gridCol w:w="6803"/>
-      <w:gridCol w:w="3402"/>
-    </w:tblGrid>
-    <w:tr>
-      <w:tc>
-        <w:tcPr>
-          <w:tcW w:type="dxa" w:w="6803"/>
-          <w:vAlign w:val="center"/>
-        </w:tcPr>
-        <w:p>
-          <w:pPr>
-            <w:spacing w:before="0" w:after="0"/>
-            <w:jc w:val="left"/>
-          </w:pPr>
-          <w:r>
-            <w:drawing>
-              <wp:inline xmlns:a="http://schemas.openxmlformats.org/drawingml/2006/main" xmlns:pic="http://schemas.openxmlformats.org/drawingml/2006/picture">
-                <wp:extent cx="2509120" cy="571500"/>
-                <wp:docPr id="1" name="Picture 1"/>
-                <wp:cNvGraphicFramePr>
-                  <a:graphicFrameLocks noChangeAspect="1"/>
-                </wp:cNvGraphicFramePr>
-                <a:graphic>
-                  <a:graphicData uri="http://schemas.openxmlformats.org/drawingml/2006/picture">
-                    <pic:pic>
-                      <pic:nvPicPr>
-                        <pic:cNvPr id="0" name="10-years-trescon-logo.png"/>
-                        <pic:cNvPicPr/>
-                      </pic:nvPicPr>
-                      <pic:blipFill>
-                        <a:blip r:embed="rId1"/>
-                        <a:stretch>
-                          <a:fillRect/>
-                        </a:stretch>
-                      </pic:blipFill>
-                      <pic:spPr>
-                        <a:xfrm>
-                          <a:off x="0" y="0"/>
-                          <a:ext cx="2509120" cy="571500"/>
-                        </a:xfrm>
-                        <a:prstGeom prst="rect"/>
-                      </pic:spPr>
-                    </pic:pic>
-                  </a:graphicData>
-                </a:graphic>
-              </wp:inline>
-            </w:drawing>
-          </w:r>
-        </w:p>
-      </w:tc>
-      <w:tc>
-        <w:tcPr>
-          <w:tcW w:type="dxa" w:w="3402"/>
-          <w:vAlign w:val="center"/>
-        </w:tcPr>
-        <w:p>
-          <w:pPr>
-            <w:spacing w:before="0" w:after="0"/>
-            <w:jc w:val="right"/>
-          </w:pPr>
-          <w:r>
-            <w:rPr>
-              <w:rFonts w:ascii="Segoe UI" w:hAnsi="Segoe UI"/>
-              <w:color w:val="0F4C5C"/>
-              <w:sz w:val="18"/>
-            </w:rPr>
-            <w:t>✉ info@tresconglobal.com</w:t>
-            <w:br/>
-          </w:r>
-          <w:r>
-            <w:rPr>
-              <w:rFonts w:ascii="Segoe UI" w:hAnsi="Segoe UI"/>
-              <w:color w:val="0F4C5C"/>
-              <w:sz w:val="18"/>
-            </w:rPr>
-            <w:t>🌐 tresconglobal.com</w:t>
-          </w:r>
-        </w:p>
-      </w:tc>
-    </w:tr>
-  </w:tbl>
   <w:p>
     <w:pPr>
-      <w:spacing w:before="80" w:after="0" w:line="20" w:lineRule="exact"/>
+      <w:spacing w:before="80" w:after="0"/>
+    </w:pPr>
+  </w:p>
+  <w:p>
+    <w:pPr>
+      <w:spacing w:before="0" w:after="0"/>
+      <w:jc w:val="right"/>
+    </w:pPr>
+    <w:r>
+      <w:rPr>
+        <w:rFonts w:ascii="Calibri" w:hAnsi="Calibri"/>
+        <w:color w:val="053B3F"/>
+        <w:sz w:val="20"/>
+      </w:rPr>
+      <w:t>•  info@tresconglobal.com</w:t>
+      <w:br/>
+    </w:r>
+    <w:r>
+      <w:rPr>
+        <w:rFonts w:ascii="Calibri" w:hAnsi="Calibri"/>
+        <w:color w:val="053B3F"/>
+        <w:sz w:val="20"/>
+      </w:rPr>
+      <w:t>•  tresconglobal.com</w:t>
+    </w:r>
+  </w:p>
+  <w:p>
+    <w:pPr>
+      <w:spacing w:before="160" w:after="0"/>
       <w:pBdr>
         <w:bottom w:val="single" w:sz="18" w:space="0" w:color="8DC63F"/>
       </w:pBdr>
     </w:pPr>
+    <w:r/>
   </w:p>
 </w:hdr>
 </file>

</xml_diff>